<commit_message>
Add guides for running, experimenting and making changes; update report
</commit_message>
<xml_diff>
--- a/VoiceGuard_Final_Report.docx
+++ b/VoiceGuard_Final_Report.docx
@@ -2525,6 +2525,73 @@
       </w:r>
       <w:r>
         <w:t xml:space="preserve">.</w:t>
+      </w:r>
+    </w:p>
+    <w:p>
+      <w:pPr>
+        <w:pStyle w:val="Compact"/>
+        <w:numPr>
+          <w:ilvl w:val="0"/>
+          <w:numId w:val="1010"/>
+        </w:numPr>
+      </w:pPr>
+      <w:r>
+        <w:rPr>
+          <w:b/>
+          <w:bCs/>
+        </w:rPr>
+        <w:t xml:space="preserve">Nothing is missed by ear.</w:t>
+      </w:r>
+      <w:r>
+        <w:t xml:space="preserve"> </w:t>
+      </w:r>
+      <w:r>
+        <w:t xml:space="preserve">When several requests arrive, each one is read in full, oldest first, instead of the newest cutting off the previous one. Every request has its own heading so screen-reader users can jump between them, and</w:t>
+      </w:r>
+      <w:r>
+        <w:t xml:space="preserve"> </w:t>
+      </w:r>
+      <w:r>
+        <w:rPr>
+          <w:b/>
+          <w:bCs/>
+        </w:rPr>
+        <w:t xml:space="preserve">Read all waiting requests</w:t>
+      </w:r>
+      <w:r>
+        <w:t xml:space="preserve">,</w:t>
+      </w:r>
+      <w:r>
+        <w:t xml:space="preserve"> </w:t>
+      </w:r>
+      <w:r>
+        <w:rPr>
+          <w:b/>
+          <w:bCs/>
+        </w:rPr>
+        <w:t xml:space="preserve">Repeat this request</w:t>
+      </w:r>
+      <w:r>
+        <w:t xml:space="preserve"> </w:t>
+      </w:r>
+      <w:r>
+        <w:t xml:space="preserve">and</w:t>
+      </w:r>
+      <w:r>
+        <w:t xml:space="preserve"> </w:t>
+      </w:r>
+      <w:r>
+        <w:rPr>
+          <w:b/>
+          <w:bCs/>
+        </w:rPr>
+        <w:t xml:space="preserve">Stop reading</w:t>
+      </w:r>
+      <w:r>
+        <w:t xml:space="preserve"> </w:t>
+      </w:r>
+      <w:r>
+        <w:t xml:space="preserve">let the user hear them again. Focus moves to the new request’s heading, never straight onto Approve, so one accidental tap cannot approve a request the user has not heard.</w:t>
       </w:r>
     </w:p>
     <w:bookmarkEnd w:id="26"/>

</xml_diff>